<commit_message>
SRS and Use Case Flow documents
</commit_message>
<xml_diff>
--- a/Documents/Use_Case_Flow.docx
+++ b/Documents/Use_Case_Flow.docx
@@ -55,6 +55,7 @@
       </w:tblGrid>
       <w:tr>
         <w:trPr>
+          <w:cantSplit/>
           <w:trHeight w:val="214"/>
           <w:jc w:val="center"/>
         </w:trPr>
@@ -118,13 +119,14 @@
                 <w:sz w:val="18"/>
                 <w:szCs w:val="18"/>
               </w:rPr>
-              <w:t>Login &amp; Role-Based Access</w:t>
+              <w:t xml:space="preserve">UC-01 – Login &amp; Role-Based Access</w:t>
             </w:r>
           </w:p>
         </w:tc>
       </w:tr>
       <w:tr>
         <w:trPr>
+          <w:cantSplit/>
           <w:trHeight w:val="214"/>
           <w:jc w:val="center"/>
         </w:trPr>
@@ -196,6 +198,7 @@
       </w:tr>
       <w:tr>
         <w:trPr>
+          <w:cantSplit/>
           <w:trHeight w:val="214"/>
           <w:jc w:val="center"/>
         </w:trPr>
@@ -260,13 +263,14 @@
                 <w:sz w:val="18"/>
                 <w:szCs w:val="18"/>
               </w:rPr>
-              <w:t>User has a registered account.</w:t>
+              <w:t xml:space="preserve">User has an active account created by the Admin (no self-registration).</w:t>
             </w:r>
           </w:p>
         </w:tc>
       </w:tr>
       <w:tr>
         <w:trPr>
+          <w:cantSplit/>
           <w:trHeight w:val="1094"/>
           <w:jc w:val="center"/>
         </w:trPr>
@@ -443,6 +447,7 @@
       </w:tr>
       <w:tr>
         <w:trPr>
+          <w:cantSplit/>
           <w:trHeight w:val="1215"/>
           <w:jc w:val="center"/>
         </w:trPr>
@@ -597,6 +602,7 @@
       </w:tr>
       <w:tr>
         <w:trPr>
+          <w:cantSplit/>
           <w:trHeight w:val="414"/>
           <w:jc w:val="center"/>
         </w:trPr>
@@ -661,7 +667,7 @@
                 <w:sz w:val="18"/>
                 <w:szCs w:val="18"/>
               </w:rPr>
-              <w:t>The action is completed and reflected consistently across the student's, faculty's, and admin's views of the system.</w:t>
+              <w:t xml:space="preserve">The user is logged in and sees the dashboard for their role; failed and blocked attempts are logged (SEC-22).</w:t>
             </w:r>
           </w:p>
         </w:tc>
@@ -703,6 +709,7 @@
       </w:tblGrid>
       <w:tr>
         <w:trPr>
+          <w:cantSplit/>
           <w:trHeight w:val="214"/>
           <w:jc w:val="center"/>
         </w:trPr>
@@ -765,15 +772,15 @@
                 <w:rFonts w:ascii="Arial" w:hAnsi="Arial"/>
                 <w:sz w:val="18"/>
                 <w:szCs w:val="18"/>
-                <w:lang w:val="de-DE"/>
-              </w:rPr>
-              <w:t>Manage Students</w:t>
+              </w:rPr>
+              <w:t xml:space="preserve">UC-02 – Manage Students</w:t>
             </w:r>
           </w:p>
         </w:tc>
       </w:tr>
       <w:tr>
         <w:trPr>
+          <w:cantSplit/>
           <w:trHeight w:val="214"/>
           <w:jc w:val="center"/>
         </w:trPr>
@@ -846,6 +853,7 @@
       </w:tr>
       <w:tr>
         <w:trPr>
+          <w:cantSplit/>
           <w:trHeight w:val="214"/>
           <w:jc w:val="center"/>
         </w:trPr>
@@ -917,6 +925,7 @@
       </w:tr>
       <w:tr>
         <w:trPr>
+          <w:cantSplit/>
           <w:trHeight w:val="1294"/>
           <w:jc w:val="center"/>
         </w:trPr>
@@ -990,7 +999,7 @@
                 <w:sz w:val="17"/>
                 <w:szCs w:val="17"/>
               </w:rPr>
-              <w:t>Admin opens the Student Management screen.</w:t>
+              <w:t xml:space="preserve">Admin opens the Student Management screen.</w:t>
             </w:r>
           </w:p>
           <w:p>
@@ -1014,7 +1023,7 @@
                 <w:sz w:val="17"/>
                 <w:szCs w:val="17"/>
               </w:rPr>
-              <w:t>Admin adds a new student with roll number, name, class, and section.</w:t>
+              <w:t xml:space="preserve">Admin adds a new student with roll number, name, class, and section.</w:t>
             </w:r>
           </w:p>
           <w:p>
@@ -1038,7 +1047,7 @@
                 <w:sz w:val="17"/>
                 <w:szCs w:val="17"/>
               </w:rPr>
-              <w:t>System validates the data and checks for duplicate roll numbers.</w:t>
+              <w:t xml:space="preserve">System validates the data and checks for duplicate roll numbers.</w:t>
             </w:r>
           </w:p>
           <w:p>
@@ -1062,7 +1071,7 @@
                 <w:sz w:val="17"/>
                 <w:szCs w:val="17"/>
               </w:rPr>
-              <w:t>System saves the student record.</w:t>
+              <w:t xml:space="preserve">System saves the student record and creates the student's login (username = roll number) with a one-time temporary password.</w:t>
             </w:r>
           </w:p>
           <w:p>
@@ -1086,13 +1095,14 @@
                 <w:sz w:val="17"/>
                 <w:szCs w:val="17"/>
               </w:rPr>
-              <w:t>Admin can update or deactivate existing student records.</w:t>
+              <w:t xml:space="preserve">Admin can update, deactivate, reactivate, or permanently delete existing student records.</w:t>
             </w:r>
           </w:p>
         </w:tc>
       </w:tr>
       <w:tr>
         <w:trPr>
+          <w:cantSplit/>
           <w:trHeight w:val="1215"/>
           <w:jc w:val="center"/>
         </w:trPr>
@@ -1177,7 +1187,6 @@
                 <w:bCs/>
                 <w:sz w:val="17"/>
                 <w:szCs w:val="17"/>
-                <w:lang w:val="it-IT"/>
               </w:rPr>
               <w:t xml:space="preserve">2a. </w:t>
             </w:r>
@@ -1187,7 +1196,7 @@
                 <w:sz w:val="17"/>
                 <w:szCs w:val="17"/>
               </w:rPr>
-              <w:t>Required field left blank: system prevents submission and highlights the field.</w:t>
+              <w:t xml:space="preserve">Required field left blank: system prevents submission and highlights the field.</w:t>
             </w:r>
           </w:p>
           <w:p>
@@ -1216,7 +1225,6 @@
                 <w:bCs/>
                 <w:sz w:val="17"/>
                 <w:szCs w:val="17"/>
-                <w:lang w:val="it-IT"/>
               </w:rPr>
               <w:t xml:space="preserve">3a. </w:t>
             </w:r>
@@ -1226,7 +1234,7 @@
                 <w:sz w:val="17"/>
                 <w:szCs w:val="17"/>
               </w:rPr>
-              <w:t>Duplicate roll number entered: system rejects and shows an error.</w:t>
+              <w:t xml:space="preserve">Duplicate roll number entered: system rejects and shows an error.</w:t>
             </w:r>
           </w:p>
           <w:p>
@@ -1242,12 +1250,165 @@
                 <w:szCs w:val="16"/>
               </w:rPr>
               <w:t xml:space="preserve"> Return to Step 2 to correct the student details.</w:t>
+            </w:r>
+          </w:p>
+          <w:p>
+            <w:pPr>
+              <w:pStyle w:val="Body"/>
+            </w:pPr>
+            <w:r>
+              <w:rPr>
+                <w:rFonts w:ascii="Arial" w:hAnsi="Arial"/>
+                <w:b/>
+                <w:bCs/>
+                <w:sz w:val="17"/>
+                <w:szCs w:val="17"/>
+              </w:rPr>
+              <w:t xml:space="preserve">5a. </w:t>
+            </w:r>
+            <w:r>
+              <w:rPr>
+                <w:rFonts w:ascii="Arial" w:hAnsi="Arial"/>
+                <w:sz w:val="17"/>
+                <w:szCs w:val="17"/>
+              </w:rPr>
+              <w:t xml:space="preserve">Admin deactivates a student: system blocks login, ends active sessions, removes the student from attendance sheets for later sessions, and keeps all attendance and audit history (labelled "Inactive").</w:t>
+            </w:r>
+          </w:p>
+          <w:p>
+            <w:pPr>
+              <w:pStyle w:val="Body"/>
+              <w:spacing w:after="40"/>
+              <w:ind w:left="259"/>
+            </w:pPr>
+            <w:r>
+              <w:rPr>
+                <w:rFonts w:ascii="Arial" w:hAnsi="Arial"/>
+                <w:sz w:val="16"/>
+                <w:szCs w:val="16"/>
+              </w:rPr>
+              <w:t xml:space="preserve"> Continue; the record can be reactivated later.</w:t>
+            </w:r>
+          </w:p>
+          <w:p>
+            <w:pPr>
+              <w:pStyle w:val="Body"/>
+            </w:pPr>
+            <w:r>
+              <w:rPr>
+                <w:rFonts w:ascii="Arial" w:hAnsi="Arial"/>
+                <w:b/>
+                <w:bCs/>
+                <w:sz w:val="17"/>
+                <w:szCs w:val="17"/>
+              </w:rPr>
+              <w:t xml:space="preserve">5b. </w:t>
+            </w:r>
+            <w:r>
+              <w:rPr>
+                <w:rFonts w:ascii="Arial" w:hAnsi="Arial"/>
+                <w:sz w:val="17"/>
+                <w:szCs w:val="17"/>
+              </w:rPr>
+              <w:t xml:space="preserve">Admin reactivates a student: system restores login and adds the student to attendance sheets from the reactivation date.</w:t>
+            </w:r>
+          </w:p>
+          <w:p>
+            <w:pPr>
+              <w:pStyle w:val="Body"/>
+              <w:spacing w:after="40"/>
+              <w:ind w:left="259"/>
+            </w:pPr>
+            <w:r>
+              <w:rPr>
+                <w:rFonts w:ascii="Arial" w:hAnsi="Arial"/>
+                <w:sz w:val="16"/>
+                <w:szCs w:val="16"/>
+              </w:rPr>
+              <w:t xml:space="preserve"> Continue.</w:t>
+            </w:r>
+          </w:p>
+          <w:p>
+            <w:pPr>
+              <w:pStyle w:val="Body"/>
+            </w:pPr>
+            <w:r>
+              <w:rPr>
+                <w:rFonts w:ascii="Arial" w:hAnsi="Arial"/>
+                <w:b/>
+                <w:bCs/>
+                <w:sz w:val="17"/>
+                <w:szCs w:val="17"/>
+              </w:rPr>
+              <w:t xml:space="preserve">5c. </w:t>
+            </w:r>
+            <w:r>
+              <w:rPr>
+                <w:rFonts w:ascii="Arial" w:hAnsi="Arial"/>
+                <w:sz w:val="17"/>
+                <w:szCs w:val="17"/>
+              </w:rPr>
+              <w:t xml:space="preserve">Admin permanently deletes a student: system shows what will be removed and requires confirmation and a reason; the profile, login, and the student's attendance records are deleted, and audit entries are kept.</w:t>
+            </w:r>
+          </w:p>
+          <w:p>
+            <w:pPr>
+              <w:pStyle w:val="Body"/>
+              <w:spacing w:after="40"/>
+              <w:ind w:left="259"/>
+            </w:pPr>
+            <w:r>
+              <w:rPr>
+                <w:rFonts w:ascii="Arial" w:hAnsi="Arial"/>
+                <w:sz w:val="16"/>
+                <w:szCs w:val="16"/>
+              </w:rPr>
+              <w:t xml:space="preserve"> If cancelled or no reason is given, nothing is deleted.</w:t>
+            </w:r>
+          </w:p>
+          <w:p>
+            <w:pPr>
+              <w:pStyle w:val="Body"/>
+            </w:pPr>
+            <w:r>
+              <w:rPr>
+                <w:rFonts w:ascii="Arial" w:hAnsi="Arial"/>
+                <w:b/>
+                <w:bCs/>
+                <w:sz w:val="17"/>
+                <w:szCs w:val="17"/>
+              </w:rPr>
+              <w:t xml:space="preserve">5d. </w:t>
+            </w:r>
+            <w:r>
+              <w:rPr>
+                <w:rFonts w:ascii="Arial" w:hAnsi="Arial"/>
+                <w:sz w:val="17"/>
+                <w:szCs w:val="17"/>
+              </w:rPr>
+              <w:t xml:space="preserve">Faculty or Student attempts to add, update, deactivate, or delete a student: system denies access and changes nothing.</w:t>
+            </w:r>
+          </w:p>
+          <w:p>
+            <w:pPr>
+              <w:pStyle w:val="Body"/>
+              <w:spacing w:after="40"/>
+              <w:ind w:left="259"/>
+            </w:pPr>
+            <w:r>
+              <w:rPr>
+                <w:rFonts w:ascii="Arial" w:hAnsi="Arial"/>
+                <w:sz w:val="16"/>
+                <w:szCs w:val="16"/>
+              </w:rPr>
+              <w:t xml:space="preserve"> Stop the request.</w:t>
             </w:r>
           </w:p>
         </w:tc>
       </w:tr>
       <w:tr>
         <w:trPr>
+          <w:cantSplit/>
           <w:trHeight w:val="414"/>
           <w:jc w:val="center"/>
         </w:trPr>
@@ -1312,7 +1473,7 @@
                 <w:sz w:val="18"/>
                 <w:szCs w:val="18"/>
               </w:rPr>
-              <w:t>The action is completed and reflected consistently across the student's, faculty's, and admin's views of the system.</w:t>
+              <w:t xml:space="preserve">The student record is saved, updated, deactivated, reactivated, or deleted as requested, and the action is logged with the Admin and time (SEC-16).</w:t>
             </w:r>
           </w:p>
         </w:tc>
@@ -1354,6 +1515,7 @@
       </w:tblGrid>
       <w:tr>
         <w:trPr>
+          <w:cantSplit/>
           <w:trHeight w:val="214"/>
           <w:jc w:val="center"/>
         </w:trPr>
@@ -1417,13 +1579,14 @@
                 <w:sz w:val="18"/>
                 <w:szCs w:val="18"/>
               </w:rPr>
-              <w:t>Manage Faculty</w:t>
+              <w:t xml:space="preserve">UC-03 – Manage Faculty</w:t>
             </w:r>
           </w:p>
         </w:tc>
       </w:tr>
       <w:tr>
         <w:trPr>
+          <w:cantSplit/>
           <w:trHeight w:val="214"/>
           <w:jc w:val="center"/>
         </w:trPr>
@@ -1496,6 +1659,7 @@
       </w:tr>
       <w:tr>
         <w:trPr>
+          <w:cantSplit/>
           <w:trHeight w:val="214"/>
           <w:jc w:val="center"/>
         </w:trPr>
@@ -1567,6 +1731,7 @@
       </w:tr>
       <w:tr>
         <w:trPr>
+          <w:cantSplit/>
           <w:trHeight w:val="1294"/>
           <w:jc w:val="center"/>
         </w:trPr>
@@ -1641,7 +1806,7 @@
                 <w:sz w:val="17"/>
                 <w:szCs w:val="17"/>
               </w:rPr>
-              <w:t>Admin opens the Faculty Management screen.</w:t>
+              <w:t xml:space="preserve">Admin opens the Faculty Management screen.</w:t>
             </w:r>
           </w:p>
           <w:p>
@@ -1665,7 +1830,7 @@
                 <w:sz w:val="17"/>
                 <w:szCs w:val="17"/>
               </w:rPr>
-              <w:t>Admin adds a new faculty member with ID, name, department, and login details.</w:t>
+              <w:t xml:space="preserve">Admin adds a new faculty member with ID, name, and department.</w:t>
             </w:r>
           </w:p>
           <w:p>
@@ -1689,7 +1854,7 @@
                 <w:sz w:val="17"/>
                 <w:szCs w:val="17"/>
               </w:rPr>
-              <w:t>System validates and saves the faculty record.</w:t>
+              <w:t xml:space="preserve">System validates and saves the faculty record and creates the login (username = faculty ID) with a one-time temporary password.</w:t>
             </w:r>
           </w:p>
           <w:p>
@@ -1713,7 +1878,7 @@
                 <w:sz w:val="17"/>
                 <w:szCs w:val="17"/>
               </w:rPr>
-              <w:t>Admin can update or deactivate faculty records.</w:t>
+              <w:t xml:space="preserve">Admin can update, deactivate, reactivate, or permanently delete faculty records.</w:t>
             </w:r>
           </w:p>
           <w:p>
@@ -1737,13 +1902,14 @@
                 <w:sz w:val="17"/>
                 <w:szCs w:val="17"/>
               </w:rPr>
-              <w:t>Admin assigns faculty to subjects/classes.</w:t>
+              <w:t xml:space="preserve">Admin assigns faculty to subjects/classes.</w:t>
             </w:r>
           </w:p>
         </w:tc>
       </w:tr>
       <w:tr>
         <w:trPr>
+          <w:cantSplit/>
           <w:trHeight w:val="1015"/>
           <w:jc w:val="center"/>
         </w:trPr>
@@ -1828,7 +1994,6 @@
                 <w:bCs/>
                 <w:sz w:val="17"/>
                 <w:szCs w:val="17"/>
-                <w:lang w:val="it-IT"/>
               </w:rPr>
               <w:t xml:space="preserve">3a. </w:t>
             </w:r>
@@ -1838,7 +2003,7 @@
                 <w:sz w:val="17"/>
                 <w:szCs w:val="17"/>
               </w:rPr>
-              <w:t>Duplicate faculty ID entered: system rejects the entry.</w:t>
+              <w:t xml:space="preserve">Duplicate faculty ID entered: system rejects the entry.</w:t>
             </w:r>
           </w:p>
           <w:p>
@@ -1867,7 +2032,6 @@
                 <w:bCs/>
                 <w:sz w:val="17"/>
                 <w:szCs w:val="17"/>
-                <w:lang w:val="it-IT"/>
               </w:rPr>
               <w:t xml:space="preserve">4a. </w:t>
             </w:r>
@@ -1877,7 +2041,7 @@
                 <w:sz w:val="17"/>
                 <w:szCs w:val="17"/>
               </w:rPr>
-              <w:t>Admin removes a faculty member who is still assigned to active classes: system warns before deletion.</w:t>
+              <w:t xml:space="preserve">Admin deactivates or deletes a faculty member who is still assigned to active classes: system blocks the action and lists the assignments.</w:t>
             </w:r>
           </w:p>
           <w:p>
@@ -1892,13 +2056,90 @@
                 <w:sz w:val="16"/>
                 <w:szCs w:val="16"/>
               </w:rPr>
-              <w:t xml:space="preserve"> Resolve the assignment before continuing.</w:t>
+              <w:t xml:space="preserve"> Reassign the classes before continuing.</w:t>
+            </w:r>
+          </w:p>
+          <w:p>
+            <w:pPr>
+              <w:pStyle w:val="Body"/>
+            </w:pPr>
+            <w:r>
+              <w:rPr>
+                <w:rFonts w:ascii="Arial" w:hAnsi="Arial"/>
+                <w:b/>
+                <w:bCs/>
+                <w:sz w:val="17"/>
+                <w:szCs w:val="17"/>
+              </w:rPr>
+              <w:t xml:space="preserve">4b. </w:t>
+            </w:r>
+            <w:r>
+              <w:rPr>
+                <w:rFonts w:ascii="Arial" w:hAnsi="Arial"/>
+                <w:sz w:val="17"/>
+                <w:szCs w:val="17"/>
+              </w:rPr>
+              <w:t xml:space="preserve">Admin permanently deletes a faculty member: system requires confirmation and a reason; the profile and login are deleted, and attendance recorded by the faculty member is kept.</w:t>
+            </w:r>
+          </w:p>
+          <w:p>
+            <w:pPr>
+              <w:pStyle w:val="Body"/>
+              <w:spacing w:after="40"/>
+              <w:ind w:left="259"/>
+            </w:pPr>
+            <w:r>
+              <w:rPr>
+                <w:rFonts w:ascii="Arial" w:hAnsi="Arial"/>
+                <w:sz w:val="16"/>
+                <w:szCs w:val="16"/>
+              </w:rPr>
+              <w:t xml:space="preserve"> If cancelled or no reason is given, nothing is deleted.</w:t>
+            </w:r>
+          </w:p>
+          <w:p>
+            <w:pPr>
+              <w:pStyle w:val="Body"/>
+            </w:pPr>
+            <w:r>
+              <w:rPr>
+                <w:rFonts w:ascii="Arial" w:hAnsi="Arial"/>
+                <w:b/>
+                <w:bCs/>
+                <w:sz w:val="17"/>
+                <w:szCs w:val="17"/>
+              </w:rPr>
+              <w:t xml:space="preserve">4c. </w:t>
+            </w:r>
+            <w:r>
+              <w:rPr>
+                <w:rFonts w:ascii="Arial" w:hAnsi="Arial"/>
+                <w:sz w:val="17"/>
+                <w:szCs w:val="17"/>
+              </w:rPr>
+              <w:t xml:space="preserve">Admin reactivates a faculty member: system restores login.</w:t>
+            </w:r>
+          </w:p>
+          <w:p>
+            <w:pPr>
+              <w:pStyle w:val="Body"/>
+              <w:spacing w:after="40"/>
+              <w:ind w:left="259"/>
+            </w:pPr>
+            <w:r>
+              <w:rPr>
+                <w:rFonts w:ascii="Arial" w:hAnsi="Arial"/>
+                <w:sz w:val="16"/>
+                <w:szCs w:val="16"/>
+              </w:rPr>
+              <w:t xml:space="preserve"> Continue.</w:t>
             </w:r>
           </w:p>
         </w:tc>
       </w:tr>
       <w:tr>
         <w:trPr>
+          <w:cantSplit/>
           <w:trHeight w:val="414"/>
           <w:jc w:val="center"/>
         </w:trPr>
@@ -1963,7 +2204,7 @@
                 <w:sz w:val="18"/>
                 <w:szCs w:val="18"/>
               </w:rPr>
-              <w:t>The action is completed and reflected consistently across the student's, faculty's, and admin's views of the system.</w:t>
+              <w:t xml:space="preserve">The faculty record and assignments are saved as requested, and account actions are logged with the Admin and time (SEC-16).</w:t>
             </w:r>
           </w:p>
         </w:tc>
@@ -2005,6 +2246,7 @@
       </w:tblGrid>
       <w:tr>
         <w:trPr>
+          <w:cantSplit/>
           <w:trHeight w:val="214"/>
           <w:jc w:val="center"/>
         </w:trPr>
@@ -2068,13 +2310,14 @@
                 <w:sz w:val="18"/>
                 <w:szCs w:val="18"/>
               </w:rPr>
-              <w:t>Manage Courses/Subjects</w:t>
+              <w:t xml:space="preserve">UC-04 – Manage Courses/Subjects</w:t>
             </w:r>
           </w:p>
         </w:tc>
       </w:tr>
       <w:tr>
         <w:trPr>
+          <w:cantSplit/>
           <w:trHeight w:val="214"/>
           <w:jc w:val="center"/>
         </w:trPr>
@@ -2146,6 +2389,7 @@
       </w:tr>
       <w:tr>
         <w:trPr>
+          <w:cantSplit/>
           <w:trHeight w:val="214"/>
           <w:jc w:val="center"/>
         </w:trPr>
@@ -2217,6 +2461,7 @@
       </w:tr>
       <w:tr>
         <w:trPr>
+          <w:cantSplit/>
           <w:trHeight w:val="874"/>
           <w:jc w:val="center"/>
         </w:trPr>
@@ -2369,6 +2614,7 @@
       </w:tr>
       <w:tr>
         <w:trPr>
+          <w:cantSplit/>
           <w:trHeight w:val="1015"/>
           <w:jc w:val="center"/>
         </w:trPr>
@@ -2453,7 +2699,6 @@
                 <w:bCs/>
                 <w:sz w:val="17"/>
                 <w:szCs w:val="17"/>
-                <w:lang w:val="it-IT"/>
               </w:rPr>
               <w:t xml:space="preserve">3a. </w:t>
             </w:r>
@@ -2463,7 +2708,7 @@
                 <w:sz w:val="17"/>
                 <w:szCs w:val="17"/>
               </w:rPr>
-              <w:t>Duplicate subject code entered: system rejects the entry.</w:t>
+              <w:t xml:space="preserve">Duplicate subject code entered: system rejects the entry.</w:t>
             </w:r>
           </w:p>
           <w:p>
@@ -2492,7 +2737,6 @@
                 <w:bCs/>
                 <w:sz w:val="17"/>
                 <w:szCs w:val="17"/>
-                <w:lang w:val="it-IT"/>
               </w:rPr>
               <w:t xml:space="preserve">4a. </w:t>
             </w:r>
@@ -2502,7 +2746,7 @@
                 <w:sz w:val="17"/>
                 <w:szCs w:val="17"/>
               </w:rPr>
-              <w:t>Subject deleted while attendance records exist for it: system warns or blocks deletion.</w:t>
+              <w:t xml:space="preserve">Subject deleted while attendance records exist for it: system blocks the deletion and shows a message.</w:t>
             </w:r>
           </w:p>
           <w:p>
@@ -2517,13 +2761,14 @@
                 <w:sz w:val="16"/>
                 <w:szCs w:val="16"/>
               </w:rPr>
-              <w:t xml:space="preserve"> Stop deletion or resolve the warning before continuing.</w:t>
+              <w:t xml:space="preserve"> Stop the deletion; the subject and its attendance records are kept.</w:t>
             </w:r>
           </w:p>
         </w:tc>
       </w:tr>
       <w:tr>
         <w:trPr>
+          <w:cantSplit/>
           <w:trHeight w:val="414"/>
           <w:jc w:val="center"/>
         </w:trPr>
@@ -2588,7 +2833,7 @@
                 <w:sz w:val="18"/>
                 <w:szCs w:val="18"/>
               </w:rPr>
-              <w:t>The action is completed and reflected consistently across the student's, faculty's, and admin's views of the system.</w:t>
+              <w:t xml:space="preserve">The subject is saved with a unique code and linked to its class/section; a subject with attendance records is never deleted.</w:t>
             </w:r>
           </w:p>
         </w:tc>
@@ -2630,6 +2875,7 @@
       </w:tblGrid>
       <w:tr>
         <w:trPr>
+          <w:cantSplit/>
           <w:trHeight w:val="214"/>
           <w:jc w:val="center"/>
         </w:trPr>
@@ -2693,13 +2939,14 @@
                 <w:sz w:val="18"/>
                 <w:szCs w:val="18"/>
               </w:rPr>
-              <w:t>Manage Classes/Sections</w:t>
+              <w:t xml:space="preserve">UC-05 – Manage Classes/Sections</w:t>
             </w:r>
           </w:p>
         </w:tc>
       </w:tr>
       <w:tr>
         <w:trPr>
+          <w:cantSplit/>
           <w:trHeight w:val="214"/>
           <w:jc w:val="center"/>
         </w:trPr>
@@ -2772,6 +3019,7 @@
       </w:tr>
       <w:tr>
         <w:trPr>
+          <w:cantSplit/>
           <w:trHeight w:val="214"/>
           <w:jc w:val="center"/>
         </w:trPr>
@@ -2843,6 +3091,7 @@
       </w:tr>
       <w:tr>
         <w:trPr>
+          <w:cantSplit/>
           <w:trHeight w:val="1094"/>
           <w:jc w:val="center"/>
         </w:trPr>
@@ -3019,6 +3268,7 @@
       </w:tr>
       <w:tr>
         <w:trPr>
+          <w:cantSplit/>
           <w:trHeight w:val="595"/>
           <w:jc w:val="center"/>
         </w:trPr>
@@ -3103,7 +3353,6 @@
                 <w:bCs/>
                 <w:sz w:val="17"/>
                 <w:szCs w:val="17"/>
-                <w:lang w:val="it-IT"/>
               </w:rPr>
               <w:t xml:space="preserve">4a. </w:t>
             </w:r>
@@ -3113,7 +3362,7 @@
                 <w:sz w:val="17"/>
                 <w:szCs w:val="17"/>
               </w:rPr>
-              <w:t>Student assigned to two overlapping sections for the same subject: system flags the conflict.</w:t>
+              <w:t xml:space="preserve">Student assigned to a second section for the same subject: system rejects the assignment and names the section the student is already in.</w:t>
             </w:r>
           </w:p>
           <w:p>
@@ -3135,6 +3384,7 @@
       </w:tr>
       <w:tr>
         <w:trPr>
+          <w:cantSplit/>
           <w:trHeight w:val="414"/>
           <w:jc w:val="center"/>
         </w:trPr>
@@ -3199,7 +3449,7 @@
                 <w:sz w:val="18"/>
                 <w:szCs w:val="18"/>
               </w:rPr>
-              <w:t>The action is completed and reflected consistently across the student's, faculty's, and admin's views of the system.</w:t>
+              <w:t xml:space="preserve">The class configuration is saved with each student in only one section per subject, and faculty and subjects are assigned to the section.</w:t>
             </w:r>
           </w:p>
         </w:tc>
@@ -3241,6 +3491,7 @@
       </w:tblGrid>
       <w:tr>
         <w:trPr>
+          <w:cantSplit/>
           <w:trHeight w:val="214"/>
           <w:jc w:val="center"/>
         </w:trPr>
@@ -3303,15 +3554,15 @@
                 <w:rFonts w:ascii="Arial" w:hAnsi="Arial"/>
                 <w:sz w:val="18"/>
                 <w:szCs w:val="18"/>
-                <w:lang w:val="fr-FR"/>
-              </w:rPr>
-              <w:t>Mark Attendance</w:t>
+              </w:rPr>
+              <w:t xml:space="preserve">UC-06 – Mark Attendance</w:t>
             </w:r>
           </w:p>
         </w:tc>
       </w:tr>
       <w:tr>
         <w:trPr>
+          <w:cantSplit/>
           <w:trHeight w:val="214"/>
           <w:jc w:val="center"/>
         </w:trPr>
@@ -3384,6 +3635,7 @@
       </w:tr>
       <w:tr>
         <w:trPr>
+          <w:cantSplit/>
           <w:trHeight w:val="414"/>
           <w:jc w:val="center"/>
         </w:trPr>
@@ -3448,13 +3700,14 @@
                 <w:sz w:val="18"/>
                 <w:szCs w:val="18"/>
               </w:rPr>
-              <w:t>Faculty is logged in and has an assigned class for the current period.</w:t>
+              <w:t xml:space="preserve">Faculty is logged in and is assigned to the selected section and subject.</w:t>
             </w:r>
           </w:p>
         </w:tc>
       </w:tr>
       <w:tr>
         <w:trPr>
+          <w:cantSplit/>
           <w:trHeight w:val="1094"/>
           <w:jc w:val="center"/>
         </w:trPr>
@@ -3528,7 +3781,7 @@
                 <w:sz w:val="17"/>
                 <w:szCs w:val="17"/>
               </w:rPr>
-              <w:t>Faculty selects the class, subject, and date.</w:t>
+              <w:t xml:space="preserve">Faculty selects the class/section, subject, date, and period.</w:t>
             </w:r>
           </w:p>
           <w:p>
@@ -3552,7 +3805,7 @@
                 <w:sz w:val="17"/>
                 <w:szCs w:val="17"/>
               </w:rPr>
-              <w:t>System displays the enrolled student list.</w:t>
+              <w:t xml:space="preserve">System displays the enrolled, active student list.</w:t>
             </w:r>
           </w:p>
           <w:p>
@@ -3576,7 +3829,7 @@
                 <w:sz w:val="17"/>
                 <w:szCs w:val="17"/>
               </w:rPr>
-              <w:t>Faculty marks each student Present or Absent.</w:t>
+              <w:t xml:space="preserve">Faculty marks each student Present or Absent.</w:t>
             </w:r>
           </w:p>
           <w:p>
@@ -3600,7 +3853,7 @@
                 <w:sz w:val="17"/>
                 <w:szCs w:val="17"/>
               </w:rPr>
-              <w:t>Faculty submits the attendance.</w:t>
+              <w:t xml:space="preserve">Faculty submits the attendance.</w:t>
             </w:r>
           </w:p>
           <w:p>
@@ -3624,13 +3877,14 @@
                 <w:sz w:val="17"/>
                 <w:szCs w:val="17"/>
               </w:rPr>
-              <w:t>System saves the record and updates attendance percentages.</w:t>
+              <w:t xml:space="preserve">System saves the session, recalculates attendance percentages, and runs the threshold check (UC-10).</w:t>
             </w:r>
           </w:p>
         </w:tc>
       </w:tr>
       <w:tr>
         <w:trPr>
+          <w:cantSplit/>
           <w:trHeight w:val="1395"/>
           <w:jc w:val="center"/>
         </w:trPr>
@@ -3715,7 +3969,6 @@
                 <w:bCs/>
                 <w:sz w:val="17"/>
                 <w:szCs w:val="17"/>
-                <w:lang w:val="it-IT"/>
               </w:rPr>
               <w:t xml:space="preserve">1a. </w:t>
             </w:r>
@@ -3725,7 +3978,7 @@
                 <w:sz w:val="17"/>
                 <w:szCs w:val="17"/>
               </w:rPr>
-              <w:t>Faculty tries to mark attendance for a class not assigned to them: system denies access.</w:t>
+              <w:t xml:space="preserve">Faculty tries to mark attendance for a class not assigned to them: system denies access.</w:t>
             </w:r>
           </w:p>
           <w:p>
@@ -3754,17 +4007,16 @@
                 <w:bCs/>
                 <w:sz w:val="17"/>
                 <w:szCs w:val="17"/>
-                <w:lang w:val="it-IT"/>
-              </w:rPr>
-              <w:t xml:space="preserve">4a. </w:t>
-            </w:r>
-            <w:r>
-              <w:rPr>
-                <w:rFonts w:ascii="Arial" w:hAnsi="Arial"/>
-                <w:sz w:val="17"/>
-                <w:szCs w:val="17"/>
-              </w:rPr>
-              <w:t>Faculty tries to submit with students left unmarked: system prompts for completion or applies a default status.</w:t>
+              </w:rPr>
+              <w:t xml:space="preserve">1b. </w:t>
+            </w:r>
+            <w:r>
+              <w:rPr>
+                <w:rFonts w:ascii="Arial" w:hAnsi="Arial"/>
+                <w:sz w:val="17"/>
+                <w:szCs w:val="17"/>
+              </w:rPr>
+              <w:t xml:space="preserve">Selected date is in the future: system rejects the selection.</w:t>
             </w:r>
           </w:p>
           <w:p>
@@ -3779,13 +4031,128 @@
                 <w:sz w:val="16"/>
                 <w:szCs w:val="16"/>
               </w:rPr>
-              <w:t xml:space="preserve"> Return to Step 3 to complete the attendance, or apply the stated default status.</w:t>
+              <w:t xml:space="preserve"> Return to Step 1 to choose a valid date.</w:t>
+            </w:r>
+          </w:p>
+          <w:p>
+            <w:pPr>
+              <w:pStyle w:val="Body"/>
+            </w:pPr>
+            <w:r>
+              <w:rPr>
+                <w:rFonts w:ascii="Arial" w:hAnsi="Arial"/>
+                <w:b/>
+                <w:bCs/>
+                <w:sz w:val="17"/>
+                <w:szCs w:val="17"/>
+              </w:rPr>
+              <w:t xml:space="preserve">1c. </w:t>
+            </w:r>
+            <w:r>
+              <w:rPr>
+                <w:rFonts w:ascii="Arial" w:hAnsi="Arial"/>
+                <w:sz w:val="17"/>
+                <w:szCs w:val="17"/>
+              </w:rPr>
+              <w:t xml:space="preserve">Selected date is outside the correction window (later than the second day after the session date): system blocks the faculty member.</w:t>
+            </w:r>
+          </w:p>
+          <w:p>
+            <w:pPr>
+              <w:pStyle w:val="Body"/>
+              <w:spacing w:after="40"/>
+              <w:ind w:left="259"/>
+            </w:pPr>
+            <w:r>
+              <w:rPr>
+                <w:rFonts w:ascii="Arial" w:hAnsi="Arial"/>
+                <w:sz w:val="16"/>
+                <w:szCs w:val="16"/>
+              </w:rPr>
+              <w:t xml:space="preserve"> Stop; contact the Admin, who can record the session with a reason (UC-07 3c).</w:t>
+            </w:r>
+          </w:p>
+          <w:p>
+            <w:pPr>
+              <w:pStyle w:val="Body"/>
+            </w:pPr>
+            <w:r>
+              <w:rPr>
+                <w:rFonts w:ascii="Arial" w:hAnsi="Arial"/>
+                <w:b/>
+                <w:bCs/>
+                <w:sz w:val="17"/>
+                <w:szCs w:val="17"/>
+              </w:rPr>
+              <w:t xml:space="preserve">1d. </w:t>
+            </w:r>
+            <w:r>
+              <w:rPr>
+                <w:rFonts w:ascii="Arial" w:hAnsi="Arial"/>
+                <w:sz w:val="17"/>
+                <w:szCs w:val="17"/>
+              </w:rPr>
+              <w:t xml:space="preserve">A session already exists for the same section, subject, date, and period: system rejects the duplicate.</w:t>
+            </w:r>
+          </w:p>
+          <w:p>
+            <w:pPr>
+              <w:pStyle w:val="Body"/>
+              <w:spacing w:after="40"/>
+              <w:ind w:left="259"/>
+            </w:pPr>
+            <w:r>
+              <w:rPr>
+                <w:rFonts w:ascii="Arial" w:hAnsi="Arial"/>
+                <w:sz w:val="16"/>
+                <w:szCs w:val="16"/>
+              </w:rPr>
+              <w:t xml:space="preserve"> Open the existing session through UC-07 to correct it.</w:t>
+            </w:r>
+          </w:p>
+          <w:p>
+            <w:pPr>
+              <w:pStyle w:val="Body"/>
+            </w:pPr>
+            <w:r>
+              <w:rPr>
+                <w:rFonts w:ascii="Arial" w:hAnsi="Arial"/>
+                <w:b/>
+                <w:bCs/>
+                <w:sz w:val="17"/>
+                <w:szCs w:val="17"/>
+              </w:rPr>
+              <w:t xml:space="preserve">4a. </w:t>
+            </w:r>
+            <w:r>
+              <w:rPr>
+                <w:rFonts w:ascii="Arial" w:hAnsi="Arial"/>
+                <w:sz w:val="17"/>
+                <w:szCs w:val="17"/>
+              </w:rPr>
+              <w:t xml:space="preserve">Faculty submits with students left unmarked: system rejects the submission, saves nothing, and highlights the unmarked students.</w:t>
+            </w:r>
+          </w:p>
+          <w:p>
+            <w:pPr>
+              <w:pStyle w:val="Body"/>
+              <w:spacing w:after="40"/>
+              <w:ind w:left="259"/>
+            </w:pPr>
+            <w:r>
+              <w:rPr>
+                <w:rFonts w:ascii="Arial" w:hAnsi="Arial"/>
+                <w:sz w:val="16"/>
+                <w:szCs w:val="16"/>
+              </w:rPr>
+              <w:t xml:space="preserve"> Return to Step 3, or click "Mark remaining as Present" to mark only the unmarked students.</w:t>
             </w:r>
           </w:p>
         </w:tc>
       </w:tr>
       <w:tr>
         <w:trPr>
+          <w:cantSplit/>
           <w:trHeight w:val="414"/>
           <w:jc w:val="center"/>
         </w:trPr>
@@ -3850,7 +4217,7 @@
                 <w:sz w:val="18"/>
                 <w:szCs w:val="18"/>
               </w:rPr>
-              <w:t>The action is completed and reflected consistently across the student's, faculty's, and admin's views of the system.</w:t>
+              <w:t xml:space="preserve">One attendance record per enrolled student is saved for the session, percentages are updated, and the threshold check has run.</w:t>
             </w:r>
           </w:p>
         </w:tc>
@@ -3892,6 +4259,7 @@
       </w:tblGrid>
       <w:tr>
         <w:trPr>
+          <w:cantSplit/>
           <w:trHeight w:val="214"/>
           <w:jc w:val="center"/>
         </w:trPr>
@@ -3955,13 +4323,14 @@
                 <w:sz w:val="18"/>
                 <w:szCs w:val="18"/>
               </w:rPr>
-              <w:t>Update/Correct Attendance</w:t>
+              <w:t xml:space="preserve">UC-07 – Update/Correct Attendance</w:t>
             </w:r>
           </w:p>
         </w:tc>
       </w:tr>
       <w:tr>
         <w:trPr>
+          <w:cantSplit/>
           <w:trHeight w:val="214"/>
           <w:jc w:val="center"/>
         </w:trPr>
@@ -4026,13 +4395,14 @@
                 <w:sz w:val="18"/>
                 <w:szCs w:val="18"/>
               </w:rPr>
-              <w:t>Faculty</w:t>
+              <w:t xml:space="preserve">Faculty / Admin</w:t>
             </w:r>
           </w:p>
         </w:tc>
       </w:tr>
       <w:tr>
         <w:trPr>
+          <w:cantSplit/>
           <w:trHeight w:val="214"/>
           <w:jc w:val="center"/>
         </w:trPr>
@@ -4104,6 +4474,7 @@
       </w:tr>
       <w:tr>
         <w:trPr>
+          <w:cantSplit/>
           <w:trHeight w:val="874"/>
           <w:jc w:val="center"/>
         </w:trPr>
@@ -4177,7 +4548,7 @@
                 <w:sz w:val="17"/>
                 <w:szCs w:val="17"/>
               </w:rPr>
-              <w:t>Faculty opens a previously submitted attendance record.</w:t>
+              <w:t xml:space="preserve">Faculty opens a previously submitted attendance record.</w:t>
             </w:r>
           </w:p>
           <w:p>
@@ -4201,7 +4572,7 @@
                 <w:sz w:val="17"/>
                 <w:szCs w:val="17"/>
               </w:rPr>
-              <w:t>Faculty changes a student's status (e.g., Absent to Present).</w:t>
+              <w:t xml:space="preserve">Faculty changes a student's status (Absent to Present or Present to Absent).</w:t>
             </w:r>
           </w:p>
           <w:p>
@@ -4225,7 +4596,7 @@
                 <w:sz w:val="17"/>
                 <w:szCs w:val="17"/>
               </w:rPr>
-              <w:t>System validates that the faculty is authorized to edit this record.</w:t>
+              <w:t xml:space="preserve">System validates that the faculty member is assigned to the class and that the edit is within the correction window (until 23:59:59 IST on the second day after the session date).</w:t>
             </w:r>
           </w:p>
           <w:p>
@@ -4249,13 +4620,14 @@
                 <w:sz w:val="17"/>
                 <w:szCs w:val="17"/>
               </w:rPr>
-              <w:t>System saves the correction and logs it in the modification history.</w:t>
+              <w:t xml:space="preserve">System saves the correction, logs it in the modification history with old and new values, and recalculates percentages.</w:t>
             </w:r>
           </w:p>
         </w:tc>
       </w:tr>
       <w:tr>
         <w:trPr>
+          <w:cantSplit/>
           <w:trHeight w:val="795"/>
           <w:jc w:val="center"/>
         </w:trPr>
@@ -4340,7 +4712,6 @@
                 <w:bCs/>
                 <w:sz w:val="17"/>
                 <w:szCs w:val="17"/>
-                <w:lang w:val="it-IT"/>
               </w:rPr>
               <w:t xml:space="preserve">3a. </w:t>
             </w:r>
@@ -4350,30 +4721,7 @@
                 <w:sz w:val="17"/>
                 <w:szCs w:val="17"/>
               </w:rPr>
-              <w:t>Faculty attempts to edit a record outside the permitted correction window: system blocks the edit.</w:t>
-            </w:r>
-          </w:p>
-          <w:p>
-            <w:pPr>
-              <w:pStyle w:val="Body"/>
-            </w:pPr>
-            <w:r>
-              <w:rPr>
-                <w:rFonts w:ascii="Arial" w:hAnsi="Arial"/>
-                <w:b/>
-                <w:bCs/>
-                <w:sz w:val="17"/>
-                <w:szCs w:val="17"/>
-              </w:rPr>
-              <w:t xml:space="preserve">3b. </w:t>
-            </w:r>
-            <w:r>
-              <w:rPr>
-                <w:rFonts w:ascii="Arial" w:hAnsi="Arial"/>
-                <w:sz w:val="17"/>
-                <w:szCs w:val="17"/>
-              </w:rPr>
-              <w:t>Unauthorized user attempts the edit: system denies access.</w:t>
+              <w:t xml:space="preserve">Faculty attempts to edit a record outside the permitted correction window: system blocks the edit and shows "Correction window closed – contact the Admin".</w:t>
             </w:r>
           </w:p>
           <w:p>
@@ -4389,12 +4737,89 @@
                 <w:szCs w:val="16"/>
               </w:rPr>
               <w:t xml:space="preserve"> Stop the edit.</w:t>
+            </w:r>
+          </w:p>
+          <w:p>
+            <w:pPr>
+              <w:pStyle w:val="Body"/>
+            </w:pPr>
+            <w:r>
+              <w:rPr>
+                <w:rFonts w:ascii="Arial" w:hAnsi="Arial"/>
+                <w:b/>
+                <w:bCs/>
+                <w:sz w:val="17"/>
+                <w:szCs w:val="17"/>
+              </w:rPr>
+              <w:t xml:space="preserve">3b. </w:t>
+            </w:r>
+            <w:r>
+              <w:rPr>
+                <w:rFonts w:ascii="Arial" w:hAnsi="Arial"/>
+                <w:sz w:val="17"/>
+                <w:szCs w:val="17"/>
+              </w:rPr>
+              <w:t xml:space="preserve">Unauthorized user attempts the edit: system denies access.</w:t>
+            </w:r>
+          </w:p>
+          <w:p>
+            <w:pPr>
+              <w:pStyle w:val="Body"/>
+              <w:spacing w:after="40"/>
+              <w:ind w:left="259"/>
+            </w:pPr>
+            <w:r>
+              <w:rPr>
+                <w:rFonts w:ascii="Arial" w:hAnsi="Arial"/>
+                <w:sz w:val="16"/>
+                <w:szCs w:val="16"/>
+              </w:rPr>
+              <w:t xml:space="preserve"> Stop the edit.</w:t>
+            </w:r>
+          </w:p>
+          <w:p>
+            <w:pPr>
+              <w:pStyle w:val="Body"/>
+            </w:pPr>
+            <w:r>
+              <w:rPr>
+                <w:rFonts w:ascii="Arial" w:hAnsi="Arial"/>
+                <w:b/>
+                <w:bCs/>
+                <w:sz w:val="17"/>
+                <w:szCs w:val="17"/>
+              </w:rPr>
+              <w:t xml:space="preserve">3c. </w:t>
+            </w:r>
+            <w:r>
+              <w:rPr>
+                <w:rFonts w:ascii="Arial" w:hAnsi="Arial"/>
+                <w:sz w:val="17"/>
+                <w:szCs w:val="17"/>
+              </w:rPr>
+              <w:t xml:space="preserve">Admin corrects a record or records a missed session (for example, after a student request once the window has closed): Admin enters a mandatory reason, and the system saves the change at any time and logs it as an Admin override with old value, new value, and reason.</w:t>
+            </w:r>
+          </w:p>
+          <w:p>
+            <w:pPr>
+              <w:pStyle w:val="Body"/>
+              <w:spacing w:after="40"/>
+              <w:ind w:left="259"/>
+            </w:pPr>
+            <w:r>
+              <w:rPr>
+                <w:rFonts w:ascii="Arial" w:hAnsi="Arial"/>
+                <w:sz w:val="16"/>
+                <w:szCs w:val="16"/>
+              </w:rPr>
+              <w:t xml:space="preserve"> If no reason is entered, the change is rejected.</w:t>
             </w:r>
           </w:p>
         </w:tc>
       </w:tr>
       <w:tr>
         <w:trPr>
+          <w:cantSplit/>
           <w:trHeight w:val="414"/>
           <w:jc w:val="center"/>
         </w:trPr>
@@ -4459,7 +4884,7 @@
                 <w:sz w:val="18"/>
                 <w:szCs w:val="18"/>
               </w:rPr>
-              <w:t>The action is completed and reflected consistently across the student's, faculty's, and admin's views of the system.</w:t>
+              <w:t xml:space="preserve">The corrected status is saved, the change is logged (SEC-21), and percentages and threshold status are updated.</w:t>
             </w:r>
           </w:p>
         </w:tc>
@@ -4501,6 +4926,7 @@
       </w:tblGrid>
       <w:tr>
         <w:trPr>
+          <w:cantSplit/>
           <w:trHeight w:val="214"/>
           <w:jc w:val="center"/>
         </w:trPr>
@@ -4564,13 +4990,14 @@
                 <w:sz w:val="18"/>
                 <w:szCs w:val="18"/>
               </w:rPr>
-              <w:t>View Attendance</w:t>
+              <w:t xml:space="preserve">UC-08 – View Attendance</w:t>
             </w:r>
           </w:p>
         </w:tc>
       </w:tr>
       <w:tr>
         <w:trPr>
+          <w:cantSplit/>
           <w:trHeight w:val="214"/>
           <w:jc w:val="center"/>
         </w:trPr>
@@ -4642,6 +5069,7 @@
       </w:tr>
       <w:tr>
         <w:trPr>
+          <w:cantSplit/>
           <w:trHeight w:val="214"/>
           <w:jc w:val="center"/>
         </w:trPr>
@@ -4713,6 +5141,7 @@
       </w:tr>
       <w:tr>
         <w:trPr>
+          <w:cantSplit/>
           <w:trHeight w:val="874"/>
           <w:jc w:val="center"/>
         </w:trPr>
@@ -4786,7 +5215,7 @@
                 <w:sz w:val="17"/>
                 <w:szCs w:val="17"/>
               </w:rPr>
-              <w:t>User navigates to the Attendance view.</w:t>
+              <w:t xml:space="preserve">User navigates to the Attendance view.</w:t>
             </w:r>
           </w:p>
           <w:p>
@@ -4810,7 +5239,7 @@
                 <w:sz w:val="17"/>
                 <w:szCs w:val="17"/>
               </w:rPr>
-              <w:t>User selects a subject or date range (optional).</w:t>
+              <w:t xml:space="preserve">User selects a subject or date range (optional).</w:t>
             </w:r>
           </w:p>
           <w:p>
@@ -4834,7 +5263,7 @@
                 <w:sz w:val="17"/>
                 <w:szCs w:val="17"/>
               </w:rPr>
-              <w:t>System retrieves and displays the relevant attendance records.</w:t>
+              <w:t xml:space="preserve">System retrieves and displays the relevant attendance records.</w:t>
             </w:r>
           </w:p>
           <w:p>
@@ -4858,13 +5287,14 @@
                 <w:sz w:val="17"/>
                 <w:szCs w:val="17"/>
               </w:rPr>
-              <w:t>System displays the calculated attendance percentage.</w:t>
+              <w:t xml:space="preserve">System displays, for each subject, classes attended / classes held and the percentage, e.g. 10/12 (83.33%), plus the overall total, e.g. 18/22 (81.82%).</w:t>
             </w:r>
           </w:p>
         </w:tc>
       </w:tr>
       <w:tr>
         <w:trPr>
+          <w:cantSplit/>
           <w:trHeight w:val="1215"/>
           <w:jc w:val="center"/>
         </w:trPr>
@@ -4949,7 +5379,6 @@
                 <w:bCs/>
                 <w:sz w:val="17"/>
                 <w:szCs w:val="17"/>
-                <w:lang w:val="it-IT"/>
               </w:rPr>
               <w:t xml:space="preserve">3a. </w:t>
             </w:r>
@@ -4959,7 +5388,7 @@
                 <w:sz w:val="17"/>
                 <w:szCs w:val="17"/>
               </w:rPr>
-              <w:t>No attendance records exist yet for the selected filter: system shows an empty state message.</w:t>
+              <w:t xml:space="preserve">No attendance records exist yet for the selected filter: system shows an empty state message.</w:t>
             </w:r>
           </w:p>
           <w:p>
@@ -4997,7 +5426,7 @@
                 <w:sz w:val="17"/>
                 <w:szCs w:val="17"/>
               </w:rPr>
-              <w:t>Student attempts to view another student's attendance: system denies access.</w:t>
+              <w:t xml:space="preserve">Student attempts to view another student's attendance: system denies access.</w:t>
             </w:r>
           </w:p>
           <w:p>
@@ -5013,12 +5442,89 @@
                 <w:szCs w:val="16"/>
               </w:rPr>
               <w:t xml:space="preserve"> Stop the request.</w:t>
+            </w:r>
+          </w:p>
+          <w:p>
+            <w:pPr>
+              <w:pStyle w:val="Body"/>
+            </w:pPr>
+            <w:r>
+              <w:rPr>
+                <w:rFonts w:ascii="Arial" w:hAnsi="Arial"/>
+                <w:b/>
+                <w:bCs/>
+                <w:sz w:val="17"/>
+                <w:szCs w:val="17"/>
+              </w:rPr>
+              <w:t xml:space="preserve">3c. </w:t>
+            </w:r>
+            <w:r>
+              <w:rPr>
+                <w:rFonts w:ascii="Arial" w:hAnsi="Arial"/>
+                <w:sz w:val="17"/>
+                <w:szCs w:val="17"/>
+              </w:rPr>
+              <w:t xml:space="preserve">Faculty attempts to view a student outside their assigned classes: system denies access.</w:t>
+            </w:r>
+          </w:p>
+          <w:p>
+            <w:pPr>
+              <w:pStyle w:val="Body"/>
+              <w:spacing w:after="40"/>
+              <w:ind w:left="259"/>
+            </w:pPr>
+            <w:r>
+              <w:rPr>
+                <w:rFonts w:ascii="Arial" w:hAnsi="Arial"/>
+                <w:sz w:val="16"/>
+                <w:szCs w:val="16"/>
+              </w:rPr>
+              <w:t xml:space="preserve"> Stop the request.</w:t>
+            </w:r>
+          </w:p>
+          <w:p>
+            <w:pPr>
+              <w:pStyle w:val="Body"/>
+            </w:pPr>
+            <w:r>
+              <w:rPr>
+                <w:rFonts w:ascii="Arial" w:hAnsi="Arial"/>
+                <w:b/>
+                <w:bCs/>
+                <w:sz w:val="17"/>
+                <w:szCs w:val="17"/>
+              </w:rPr>
+              <w:t xml:space="preserve">4a. </w:t>
+            </w:r>
+            <w:r>
+              <w:rPr>
+                <w:rFonts w:ascii="Arial" w:hAnsi="Arial"/>
+                <w:sz w:val="17"/>
+                <w:szCs w:val="17"/>
+              </w:rPr>
+              <w:t xml:space="preserve">A subject has no sessions yet: system shows "N/A – no classes yet" instead of a percentage.</w:t>
+            </w:r>
+          </w:p>
+          <w:p>
+            <w:pPr>
+              <w:pStyle w:val="Body"/>
+              <w:spacing w:after="40"/>
+              <w:ind w:left="259"/>
+            </w:pPr>
+            <w:r>
+              <w:rPr>
+                <w:rFonts w:ascii="Arial" w:hAnsi="Arial"/>
+                <w:sz w:val="16"/>
+                <w:szCs w:val="16"/>
+              </w:rPr>
+              <w:t xml:space="preserve"> Continue.</w:t>
             </w:r>
           </w:p>
         </w:tc>
       </w:tr>
       <w:tr>
         <w:trPr>
+          <w:cantSplit/>
           <w:trHeight w:val="414"/>
           <w:jc w:val="center"/>
         </w:trPr>
@@ -5084,7 +5590,7 @@
                 <w:sz w:val="18"/>
                 <w:szCs w:val="18"/>
               </w:rPr>
-              <w:t>The action is completed and reflected consistently across the student's, faculty's, and admin's views of the system.</w:t>
+              <w:t xml:space="preserve">The user sees only the attendance they are authorized to view, with counts and percentages calculated as defined in SRS AR-09 to AR-11.</w:t>
             </w:r>
           </w:p>
         </w:tc>
@@ -5126,6 +5632,7 @@
       </w:tblGrid>
       <w:tr>
         <w:trPr>
+          <w:cantSplit/>
           <w:trHeight w:val="214"/>
           <w:jc w:val="center"/>
         </w:trPr>
@@ -5189,13 +5696,14 @@
                 <w:sz w:val="18"/>
                 <w:szCs w:val="18"/>
               </w:rPr>
-              <w:t>Generate &amp; Export Reports</w:t>
+              <w:t xml:space="preserve">UC-09 – Generate &amp; Export Reports</w:t>
             </w:r>
           </w:p>
         </w:tc>
       </w:tr>
       <w:tr>
         <w:trPr>
+          <w:cantSplit/>
           <w:trHeight w:val="214"/>
           <w:jc w:val="center"/>
         </w:trPr>
@@ -5267,6 +5775,7 @@
       </w:tr>
       <w:tr>
         <w:trPr>
+          <w:cantSplit/>
           <w:trHeight w:val="214"/>
           <w:jc w:val="center"/>
         </w:trPr>
@@ -5338,6 +5847,7 @@
       </w:tr>
       <w:tr>
         <w:trPr>
+          <w:cantSplit/>
           <w:trHeight w:val="1094"/>
           <w:jc w:val="center"/>
         </w:trPr>
@@ -5514,6 +6024,7 @@
       </w:tr>
       <w:tr>
         <w:trPr>
+          <w:cantSplit/>
           <w:trHeight w:val="1215"/>
           <w:jc w:val="center"/>
         </w:trPr>
@@ -5669,6 +6180,7 @@
       </w:tr>
       <w:tr>
         <w:trPr>
+          <w:cantSplit/>
           <w:trHeight w:val="414"/>
           <w:jc w:val="center"/>
         </w:trPr>
@@ -5775,6 +6287,7 @@
       </w:tblGrid>
       <w:tr>
         <w:trPr>
+          <w:cantSplit/>
           <w:trHeight w:val="214"/>
           <w:jc w:val="center"/>
         </w:trPr>
@@ -5838,13 +6351,14 @@
                 <w:sz w:val="18"/>
                 <w:szCs w:val="18"/>
               </w:rPr>
-              <w:t>Low Attendance Detection &amp; Notification</w:t>
+              <w:t xml:space="preserve">UC-10 – Low Attendance Detection &amp; Notification</w:t>
             </w:r>
           </w:p>
         </w:tc>
       </w:tr>
       <w:tr>
         <w:trPr>
+          <w:cantSplit/>
           <w:trHeight w:val="214"/>
           <w:jc w:val="center"/>
         </w:trPr>
@@ -5908,15 +6422,15 @@
                 <w:rFonts w:ascii="Arial" w:hAnsi="Arial"/>
                 <w:sz w:val="18"/>
                 <w:szCs w:val="18"/>
-                <w:lang w:val="de-DE"/>
-              </w:rPr>
-              <w:t>System / Student</w:t>
+              </w:rPr>
+              <w:t xml:space="preserve">System / Student / Faculty</w:t>
             </w:r>
           </w:p>
         </w:tc>
       </w:tr>
       <w:tr>
         <w:trPr>
+          <w:cantSplit/>
           <w:trHeight w:val="214"/>
           <w:jc w:val="center"/>
         </w:trPr>
@@ -5981,13 +6495,14 @@
                 <w:sz w:val="18"/>
                 <w:szCs w:val="18"/>
               </w:rPr>
-              <w:t>Attendance threshold is configured by the Admin.</w:t>
+              <w:t xml:space="preserve">Attendance threshold is configured by the Admin (default 75%).</w:t>
             </w:r>
           </w:p>
         </w:tc>
       </w:tr>
       <w:tr>
         <w:trPr>
+          <w:cantSplit/>
           <w:trHeight w:val="1694"/>
           <w:jc w:val="center"/>
         </w:trPr>
@@ -6061,7 +6576,7 @@
                 <w:sz w:val="17"/>
                 <w:szCs w:val="17"/>
               </w:rPr>
-              <w:t>System recalculates attendance percentage after every update.</w:t>
+              <w:t xml:space="preserve">System recalculates attendance percentages after every save or correction, and when the Admin changes the threshold.</w:t>
             </w:r>
           </w:p>
           <w:p>
@@ -6085,7 +6600,7 @@
                 <w:sz w:val="17"/>
                 <w:szCs w:val="17"/>
               </w:rPr>
-              <w:t>System compares the percentage against the configured minimum threshold.</w:t>
+              <w:t xml:space="preserve">System compares each subject percentage and the overall percentage (exact, unrounded) against the threshold.</w:t>
             </w:r>
           </w:p>
           <w:p>
@@ -6109,7 +6624,7 @@
                 <w:sz w:val="17"/>
                 <w:szCs w:val="17"/>
               </w:rPr>
-              <w:t>System flags students below the threshold.</w:t>
+              <w:t xml:space="preserve">System flags a student when a percentage is below the threshold; a percentage equal to the threshold is not flagged.</w:t>
             </w:r>
           </w:p>
           <w:p>
@@ -6133,7 +6648,7 @@
                 <w:sz w:val="17"/>
                 <w:szCs w:val="17"/>
               </w:rPr>
-              <w:t>System sends a notification to the affected student (and optionally faculty).</w:t>
+              <w:t xml:space="preserve">When a subject or overall percentage newly falls below the threshold, system sends the student one in-app notification and one email.</w:t>
             </w:r>
           </w:p>
           <w:p>
@@ -6157,13 +6672,14 @@
                 <w:sz w:val="17"/>
                 <w:szCs w:val="17"/>
               </w:rPr>
-              <w:t>Faculty/Admin can view a list of all students currently below threshold.</w:t>
+              <w:t xml:space="preserve">Faculty/Admin can view the list of students currently below threshold; every Monday at 08:00 each faculty member is emailed the list for their assigned subjects.</w:t>
             </w:r>
           </w:p>
         </w:tc>
       </w:tr>
       <w:tr>
         <w:trPr>
+          <w:cantSplit/>
           <w:trHeight w:val="1215"/>
           <w:jc w:val="center"/>
         </w:trPr>
@@ -6248,7 +6764,6 @@
                 <w:bCs/>
                 <w:sz w:val="17"/>
                 <w:szCs w:val="17"/>
-                <w:lang w:val="it-IT"/>
               </w:rPr>
               <w:t xml:space="preserve">2a. </w:t>
             </w:r>
@@ -6258,7 +6773,7 @@
                 <w:sz w:val="17"/>
                 <w:szCs w:val="17"/>
               </w:rPr>
-              <w:t>Threshold not yet configured: system uses a default institutional value.</w:t>
+              <w:t xml:space="preserve">Threshold not yet configured: system uses the default value of 75%.</w:t>
             </w:r>
           </w:p>
           <w:p>
@@ -6287,17 +6802,16 @@
                 <w:bCs/>
                 <w:sz w:val="17"/>
                 <w:szCs w:val="17"/>
-                <w:lang w:val="it-IT"/>
-              </w:rPr>
-              <w:t xml:space="preserve">3a. </w:t>
-            </w:r>
-            <w:r>
-              <w:rPr>
-                <w:rFonts w:ascii="Arial" w:hAnsi="Arial"/>
-                <w:sz w:val="17"/>
-                <w:szCs w:val="17"/>
-              </w:rPr>
-              <w:t>Student's attendance recovers above the threshold: system stops further notifications.</w:t>
+              </w:rPr>
+              <w:t xml:space="preserve">2b. </w:t>
+            </w:r>
+            <w:r>
+              <w:rPr>
+                <w:rFonts w:ascii="Arial" w:hAnsi="Arial"/>
+                <w:sz w:val="17"/>
+                <w:szCs w:val="17"/>
+              </w:rPr>
+              <w:t xml:space="preserve">A subject has no sessions yet: system does not evaluate or flag it.</w:t>
             </w:r>
           </w:p>
           <w:p>
@@ -6312,13 +6826,166 @@
                 <w:sz w:val="16"/>
                 <w:szCs w:val="16"/>
               </w:rPr>
-              <w:t>Continue without further notifications.</w:t>
+              <w:t xml:space="preserve"> Continue.</w:t>
+            </w:r>
+          </w:p>
+          <w:p>
+            <w:pPr>
+              <w:pStyle w:val="Body"/>
+            </w:pPr>
+            <w:r>
+              <w:rPr>
+                <w:rFonts w:ascii="Arial" w:hAnsi="Arial"/>
+                <w:b/>
+                <w:bCs/>
+                <w:sz w:val="17"/>
+                <w:szCs w:val="17"/>
+              </w:rPr>
+              <w:t xml:space="preserve">3a. </w:t>
+            </w:r>
+            <w:r>
+              <w:rPr>
+                <w:rFonts w:ascii="Arial" w:hAnsi="Arial"/>
+                <w:sz w:val="17"/>
+                <w:szCs w:val="17"/>
+              </w:rPr>
+              <w:t xml:space="preserve">Student's attendance recovers to or above the threshold: system clears the flag and sends no further notifications.</w:t>
+            </w:r>
+          </w:p>
+          <w:p>
+            <w:pPr>
+              <w:pStyle w:val="Body"/>
+              <w:spacing w:after="40"/>
+              <w:ind w:left="259"/>
+            </w:pPr>
+            <w:r>
+              <w:rPr>
+                <w:rFonts w:ascii="Arial" w:hAnsi="Arial"/>
+                <w:sz w:val="16"/>
+                <w:szCs w:val="16"/>
+              </w:rPr>
+              <w:t xml:space="preserve"> A later drop below the threshold sends a new notification.</w:t>
+            </w:r>
+          </w:p>
+          <w:p>
+            <w:pPr>
+              <w:pStyle w:val="Body"/>
+            </w:pPr>
+            <w:r>
+              <w:rPr>
+                <w:rFonts w:ascii="Arial" w:hAnsi="Arial"/>
+                <w:b/>
+                <w:bCs/>
+                <w:sz w:val="17"/>
+                <w:szCs w:val="17"/>
+              </w:rPr>
+              <w:t xml:space="preserve">4a. </w:t>
+            </w:r>
+            <w:r>
+              <w:rPr>
+                <w:rFonts w:ascii="Arial" w:hAnsi="Arial"/>
+                <w:sz w:val="17"/>
+                <w:szCs w:val="17"/>
+              </w:rPr>
+              <w:t xml:space="preserve">Student's attendance is already below the threshold and drops further: system sends no repeat notification.</w:t>
+            </w:r>
+          </w:p>
+          <w:p>
+            <w:pPr>
+              <w:pStyle w:val="Body"/>
+              <w:spacing w:after="40"/>
+              <w:ind w:left="259"/>
+            </w:pPr>
+            <w:r>
+              <w:rPr>
+                <w:rFonts w:ascii="Arial" w:hAnsi="Arial"/>
+                <w:sz w:val="16"/>
+                <w:szCs w:val="16"/>
+              </w:rPr>
+              <w:t xml:space="preserve"> Continue.</w:t>
+            </w:r>
+          </w:p>
+          <w:p>
+            <w:pPr>
+              <w:pStyle w:val="Body"/>
+            </w:pPr>
+            <w:r>
+              <w:rPr>
+                <w:rFonts w:ascii="Arial" w:hAnsi="Arial"/>
+                <w:b/>
+                <w:bCs/>
+                <w:sz w:val="17"/>
+                <w:szCs w:val="17"/>
+              </w:rPr>
+              <w:t xml:space="preserve">4b. </w:t>
+            </w:r>
+            <w:r>
+              <w:rPr>
+                <w:rFonts w:ascii="Arial" w:hAnsi="Arial"/>
+                <w:sz w:val="17"/>
+                <w:szCs w:val="17"/>
+              </w:rPr>
+              <w:t xml:space="preserve">Email delivery fails: the in-app notification is still delivered and the failure is logged.</w:t>
+            </w:r>
+          </w:p>
+          <w:p>
+            <w:pPr>
+              <w:pStyle w:val="Body"/>
+              <w:spacing w:after="40"/>
+              <w:ind w:left="259"/>
+            </w:pPr>
+            <w:r>
+              <w:rPr>
+                <w:rFonts w:ascii="Arial" w:hAnsi="Arial"/>
+                <w:sz w:val="16"/>
+                <w:szCs w:val="16"/>
+              </w:rPr>
+              <w:t xml:space="preserve"> Continue.</w:t>
+            </w:r>
+          </w:p>
+          <w:p>
+            <w:pPr>
+              <w:pStyle w:val="Body"/>
+            </w:pPr>
+            <w:r>
+              <w:rPr>
+                <w:rFonts w:ascii="Arial" w:hAnsi="Arial"/>
+                <w:b/>
+                <w:bCs/>
+                <w:sz w:val="17"/>
+                <w:szCs w:val="17"/>
+              </w:rPr>
+              <w:t xml:space="preserve">5a. </w:t>
+            </w:r>
+            <w:r>
+              <w:rPr>
+                <w:rFonts w:ascii="Arial" w:hAnsi="Arial"/>
+                <w:sz w:val="17"/>
+                <w:szCs w:val="17"/>
+              </w:rPr>
+              <w:t xml:space="preserve">No students in the faculty member's subjects are below the threshold: system sends no Monday email.</w:t>
+            </w:r>
+          </w:p>
+          <w:p>
+            <w:pPr>
+              <w:pStyle w:val="Body"/>
+              <w:spacing w:after="40"/>
+              <w:ind w:left="259"/>
+            </w:pPr>
+            <w:r>
+              <w:rPr>
+                <w:rFonts w:ascii="Arial" w:hAnsi="Arial"/>
+                <w:sz w:val="16"/>
+                <w:szCs w:val="16"/>
+              </w:rPr>
+              <w:t xml:space="preserve"> Continue.</w:t>
             </w:r>
           </w:p>
         </w:tc>
       </w:tr>
       <w:tr>
         <w:trPr>
+          <w:cantSplit/>
           <w:trHeight w:val="414"/>
           <w:jc w:val="center"/>
         </w:trPr>
@@ -6383,7 +7050,7 @@
                 <w:sz w:val="18"/>
                 <w:szCs w:val="18"/>
               </w:rPr>
-              <w:t>The action is completed and reflected consistently across the student's, faculty's, and admin's views of the system.</w:t>
+              <w:t xml:space="preserve">Flags and notifications reflect the current percentages; each drop below the threshold produces exactly one notification.</w:t>
             </w:r>
           </w:p>
         </w:tc>
@@ -6425,6 +7092,7 @@
       </w:tblGrid>
       <w:tr>
         <w:trPr>
+          <w:cantSplit/>
           <w:trHeight w:val="214"/>
           <w:jc w:val="center"/>
         </w:trPr>
@@ -6488,13 +7156,14 @@
                 <w:sz w:val="18"/>
                 <w:szCs w:val="18"/>
               </w:rPr>
-              <w:t>Search &amp; Filter Records</w:t>
+              <w:t xml:space="preserve">UC-11 – Search &amp; Filter Records</w:t>
             </w:r>
           </w:p>
         </w:tc>
       </w:tr>
       <w:tr>
         <w:trPr>
+          <w:cantSplit/>
           <w:trHeight w:val="214"/>
           <w:jc w:val="center"/>
         </w:trPr>
@@ -6566,6 +7235,7 @@
       </w:tr>
       <w:tr>
         <w:trPr>
+          <w:cantSplit/>
           <w:trHeight w:val="214"/>
           <w:jc w:val="center"/>
         </w:trPr>
@@ -6637,6 +7307,7 @@
       </w:tr>
       <w:tr>
         <w:trPr>
+          <w:cantSplit/>
           <w:trHeight w:val="854"/>
           <w:jc w:val="center"/>
         </w:trPr>
@@ -6765,6 +7436,7 @@
       </w:tr>
       <w:tr>
         <w:trPr>
+          <w:cantSplit/>
           <w:trHeight w:val="1015"/>
           <w:jc w:val="center"/>
         </w:trPr>
@@ -6920,6 +7592,7 @@
       </w:tr>
       <w:tr>
         <w:trPr>
+          <w:cantSplit/>
           <w:trHeight w:val="414"/>
           <w:jc w:val="center"/>
         </w:trPr>
@@ -7026,6 +7699,7 @@
       </w:tblGrid>
       <w:tr>
         <w:trPr>
+          <w:cantSplit/>
           <w:trHeight w:val="214"/>
           <w:jc w:val="center"/>
         </w:trPr>
@@ -7089,13 +7763,14 @@
                 <w:sz w:val="18"/>
                 <w:szCs w:val="18"/>
               </w:rPr>
-              <w:t>Dashboard &amp; Logout</w:t>
+              <w:t xml:space="preserve">UC-12 – Dashboard &amp; Logout</w:t>
             </w:r>
           </w:p>
         </w:tc>
       </w:tr>
       <w:tr>
         <w:trPr>
+          <w:cantSplit/>
           <w:trHeight w:val="214"/>
           <w:jc w:val="center"/>
         </w:trPr>
@@ -7167,6 +7842,7 @@
       </w:tr>
       <w:tr>
         <w:trPr>
+          <w:cantSplit/>
           <w:trHeight w:val="214"/>
           <w:jc w:val="center"/>
         </w:trPr>
@@ -7238,6 +7914,7 @@
       </w:tr>
       <w:tr>
         <w:trPr>
+          <w:cantSplit/>
           <w:trHeight w:val="1274"/>
           <w:jc w:val="center"/>
         </w:trPr>
@@ -7390,6 +8067,7 @@
       </w:tr>
       <w:tr>
         <w:trPr>
+          <w:cantSplit/>
           <w:trHeight w:val="595"/>
           <w:jc w:val="center"/>
         </w:trPr>
@@ -7506,6 +8184,7 @@
       </w:tr>
       <w:tr>
         <w:trPr>
+          <w:cantSplit/>
           <w:trHeight w:val="414"/>
           <w:jc w:val="center"/>
         </w:trPr>
@@ -7612,6 +8291,7 @@
       </w:tblGrid>
       <w:tr>
         <w:trPr>
+          <w:cantSplit/>
           <w:trHeight w:val="214"/>
           <w:jc w:val="center"/>
         </w:trPr>
@@ -7675,13 +8355,14 @@
                 <w:sz w:val="18"/>
                 <w:szCs w:val="18"/>
               </w:rPr>
-              <w:t>Data Backup &amp; Recovery</w:t>
+              <w:t xml:space="preserve">UC-13 – Data Backup &amp; Recovery</w:t>
             </w:r>
           </w:p>
         </w:tc>
       </w:tr>
       <w:tr>
         <w:trPr>
+          <w:cantSplit/>
           <w:trHeight w:val="214"/>
           <w:jc w:val="center"/>
         </w:trPr>
@@ -7754,6 +8435,7 @@
       </w:tr>
       <w:tr>
         <w:trPr>
+          <w:cantSplit/>
           <w:trHeight w:val="214"/>
           <w:jc w:val="center"/>
         </w:trPr>
@@ -7825,6 +8507,7 @@
       </w:tr>
       <w:tr>
         <w:trPr>
+          <w:cantSplit/>
           <w:trHeight w:val="1894"/>
           <w:jc w:val="center"/>
         </w:trPr>
@@ -8001,6 +8684,7 @@
       </w:tr>
       <w:tr>
         <w:trPr>
+          <w:cantSplit/>
           <w:trHeight w:val="1215"/>
           <w:jc w:val="center"/>
         </w:trPr>
@@ -8156,6 +8840,7 @@
       </w:tr>
       <w:tr>
         <w:trPr>
+          <w:cantSplit/>
           <w:trHeight w:val="414"/>
           <w:jc w:val="center"/>
         </w:trPr>

</xml_diff>